<commit_message>
Updated the requirements stimation in the SRS document
</commit_message>
<xml_diff>
--- a/docs/draft/02_analysis/es/(IX) 20260220 Mexus - Project Plan & Phases v0.1.docx
+++ b/docs/draft/02_analysis/es/(IX) 20260220 Mexus - Project Plan & Phases v0.1.docx
@@ -1188,7 +1188,19 @@
           <w:rPr>
             <w:rStyle w:val="Hipervnculo"/>
           </w:rPr>
-          <w:t>Introducción</w:t>
+          <w:t>Introdu</w:t>
+        </w:r>
+        <w:r>
+          <w:rPr>
+            <w:rStyle w:val="Hipervnculo"/>
+          </w:rPr>
+          <w:t>c</w:t>
+        </w:r>
+        <w:r>
+          <w:rPr>
+            <w:rStyle w:val="Hipervnculo"/>
+          </w:rPr>
+          <w:t>ción</w:t>
         </w:r>
       </w:hyperlink>
     </w:p>
@@ -1978,6 +1990,12 @@
       <w:r>
         <w:t>Aprobación de versión v0.1.0</w:t>
       </w:r>
+    </w:p>
+    <w:p>
+      <w:pPr>
+        <w:spacing w:after="200" w:line="276" w:lineRule="auto"/>
+        <w:contextualSpacing w:val="0"/>
+      </w:pPr>
     </w:p>
     <w:p>
       <w:pPr>
@@ -3335,8 +3353,6 @@
     </w:tbl>
     <w:p>
       <w:pPr>
-        <w:spacing w:after="200" w:line="276" w:lineRule="auto"/>
-        <w:contextualSpacing w:val="0"/>
         <w:rPr>
           <w:rStyle w:val="Ttulo1Car"/>
           <w:caps w:val="0"/>
@@ -4560,53 +4576,63 @@
       </w:r>
     </w:p>
     <w:p>
+      <w:r>
+        <w:t>Elaboración y cierre de:</w:t>
+      </w:r>
+    </w:p>
+    <w:p/>
+    <w:p>
       <w:pPr>
         <w:numPr>
           <w:ilvl w:val="0"/>
           <w:numId w:val="165"/>
         </w:numPr>
       </w:pPr>
-      <w:r>
-        <w:t>Elaboración y cierre de:</w:t>
-      </w:r>
+      <w:hyperlink r:id="rId16" w:history="1">
+        <w:r>
+          <w:rPr>
+            <w:rStyle w:val="Hipervnculo"/>
+          </w:rPr>
+          <w:t>SRS</w:t>
+        </w:r>
+      </w:hyperlink>
     </w:p>
     <w:p>
       <w:pPr>
         <w:numPr>
-          <w:ilvl w:val="1"/>
+          <w:ilvl w:val="0"/>
           <w:numId w:val="165"/>
         </w:numPr>
       </w:pPr>
-      <w:r>
-        <w:t>SRS</w:t>
-      </w:r>
+      <w:hyperlink r:id="rId17" w:history="1">
+        <w:r>
+          <w:rPr>
+            <w:rStyle w:val="Hipervnculo"/>
+          </w:rPr>
+          <w:t>SAD</w:t>
+        </w:r>
+      </w:hyperlink>
     </w:p>
     <w:p>
       <w:pPr>
         <w:numPr>
-          <w:ilvl w:val="1"/>
+          <w:ilvl w:val="0"/>
           <w:numId w:val="165"/>
         </w:numPr>
       </w:pPr>
-      <w:r>
-        <w:t>SAD</w:t>
-      </w:r>
+      <w:hyperlink r:id="rId18" w:history="1">
+        <w:r>
+          <w:rPr>
+            <w:rStyle w:val="Hipervnculo"/>
+          </w:rPr>
+          <w:t>Plan de Pruebas</w:t>
+        </w:r>
+      </w:hyperlink>
     </w:p>
     <w:p>
       <w:pPr>
         <w:numPr>
-          <w:ilvl w:val="1"/>
-          <w:numId w:val="165"/>
-        </w:numPr>
-      </w:pPr>
-      <w:r>
-        <w:t>Plan de Pruebas</w:t>
-      </w:r>
-    </w:p>
-    <w:p>
-      <w:pPr>
-        <w:numPr>
-          <w:ilvl w:val="1"/>
+          <w:ilvl w:val="0"/>
           <w:numId w:val="165"/>
         </w:numPr>
       </w:pPr>
@@ -4617,7 +4643,7 @@
     <w:p>
       <w:pPr>
         <w:numPr>
-          <w:ilvl w:val="1"/>
+          <w:ilvl w:val="0"/>
           <w:numId w:val="165"/>
         </w:numPr>
       </w:pPr>
@@ -4628,7 +4654,7 @@
     <w:p>
       <w:pPr>
         <w:numPr>
-          <w:ilvl w:val="1"/>
+          <w:ilvl w:val="0"/>
           <w:numId w:val="165"/>
         </w:numPr>
       </w:pPr>
@@ -5750,7 +5776,7 @@
       <w:r>
         <w:t xml:space="preserve"> </w:t>
       </w:r>
-      <w:hyperlink r:id="rId16" w:history="1">
+      <w:hyperlink r:id="rId19" w:history="1">
         <w:r>
           <w:rPr>
             <w:rStyle w:val="Hipervnculo"/>
@@ -6395,8 +6421,8 @@
       </w:pPr>
     </w:p>
     <w:sectPr>
-      <w:headerReference w:type="default" r:id="rId17"/>
-      <w:footerReference w:type="default" r:id="rId18"/>
+      <w:headerReference w:type="default" r:id="rId20"/>
+      <w:footerReference w:type="default" r:id="rId21"/>
       <w:pgSz w:w="11906" w:h="16838" w:code="9"/>
       <w:pgMar w:top="720" w:right="936" w:bottom="720" w:left="936" w:header="0" w:footer="289" w:gutter="0"/>
       <w:pgNumType w:start="1"/>
@@ -22007,7 +22033,7 @@
   <w:abstractNum w:abstractNumId="119" w15:restartNumberingAfterBreak="0">
     <w:nsid w:val="490C07D2"/>
     <w:multiLevelType w:val="multilevel"/>
-    <w:tmpl w:val="68A4F688"/>
+    <w:tmpl w:val="F2CC409A"/>
     <w:lvl w:ilvl="0">
       <w:start w:val="1"/>
       <w:numFmt w:val="bullet"/>
@@ -22027,17 +22053,15 @@
     <w:lvl w:ilvl="1">
       <w:start w:val="1"/>
       <w:numFmt w:val="bullet"/>
-      <w:lvlText w:val="o"/>
-      <w:lvlJc w:val="left"/>
-      <w:pPr>
-        <w:tabs>
-          <w:tab w:val="num" w:pos="1440"/>
-        </w:tabs>
+      <w:lvlText w:val=""/>
+      <w:lvlJc w:val="left"/>
+      <w:pPr>
         <w:ind w:left="1440" w:hanging="360"/>
       </w:pPr>
       <w:rPr>
-        <w:rFonts w:ascii="Courier New" w:hAnsi="Courier New" w:hint="default"/>
-        <w:sz w:val="20"/>
+        <w:rFonts w:ascii="Symbol" w:hAnsi="Symbol" w:hint="default"/>
+        <w:sz w:val="18"/>
+        <w:szCs w:val="18"/>
       </w:rPr>
     </w:lvl>
     <w:lvl w:ilvl="2" w:tentative="1">
@@ -35512,6 +35536,7 @@
     <w:sig w:usb0="00000000" w:usb1="10000000" w:usb2="00000000" w:usb3="00000000" w:csb0="80000000" w:csb1="00000000"/>
   </w:font>
   <w:font w:name="Calibri">
+    <w:altName w:val="Calibri"/>
     <w:panose1 w:val="020F0502020204030204"/>
     <w:charset w:val="00"/>
     <w:family w:val="swiss"/>
@@ -35617,6 +35642,7 @@
     <w:rsid w:val="006E4AAA"/>
     <w:rsid w:val="00785827"/>
     <w:rsid w:val="007C7E7F"/>
+    <w:rsid w:val="007E5581"/>
     <w:rsid w:val="00815D96"/>
     <w:rsid w:val="008711EC"/>
     <w:rsid w:val="008B65C8"/>
@@ -35630,7 +35656,6 @@
     <w:rsid w:val="00CF6E29"/>
     <w:rsid w:val="00D6343F"/>
     <w:rsid w:val="00D64F39"/>
-    <w:rsid w:val="00DE3543"/>
     <w:rsid w:val="00E62476"/>
     <w:rsid w:val="00EF27E6"/>
     <w:rsid w:val="00F00D41"/>

</xml_diff>